<commit_message>
Tétum revisto pelo Simão (introdução do motorista, requisitos, cancelamentos e Termos)
Co-Authored-By: Claude Opus 5.5 <noreply@anthropic.com>
</commit_message>
<xml_diff>
--- a/juridico/Tetum por rever 10-10 - parte 2.docx
+++ b/juridico/Tetum por rever 10-10 - parte 2.docx
@@ -10,7 +10,7 @@
           <w:sz w:val="28"/>
           <w:szCs w:val="28"/>
         </w:rPr>
-        <w:t xml:space="preserve">HAKAT — Tétum por rever, parte 2 (veículo de terceiro, 10/10/2026)</w:t>
+        <w:t xml:space="preserve">HAKAT — Tétum por rever, parte 2 (veículo de terceiro e seguro, 10/10/2026)</w:t>
       </w:r>
     </w:p>
     <w:p>
@@ -198,6 +198,73 @@
                 <w:sz w:val="19"/>
                 <w:szCs w:val="19"/>
               </w:rPr>
+              <w:t xml:space="preserve">App · reqInfoSeguro</w:t>
+            </w:r>
+          </w:p>
+        </w:tc>
+        <w:tc>
+          <w:tcPr>
+            <w:tcW w:type="pct" w:w="29%"/>
+          </w:tcPr>
+          <w:p>
+            <w:r>
+              <w:rPr>
+                <w:b w:val="false"/>
+                <w:bCs w:val="false"/>
+                <w:sz w:val="19"/>
+                <w:szCs w:val="19"/>
+              </w:rPr>
+              <w:t xml:space="preserve">O seguro do veículo é obrigatório por lei. Pode enviar já o cartão do seguro na aplicação: quem o envia mostra ao passageiro o selo «Seguro ✓». A HAKAT vai passar a exigi-lo, com aviso de 30 dias.</w:t>
+            </w:r>
+          </w:p>
+        </w:tc>
+        <w:tc>
+          <w:tcPr>
+            <w:tcW w:type="pct" w:w="30%"/>
+            <w:shd w:fill="FFF8F5" w:val="clear"/>
+          </w:tcPr>
+          <w:p>
+            <w:r>
+              <w:rPr>
+                <w:b w:val="false"/>
+                <w:bCs w:val="false"/>
+                <w:sz w:val="19"/>
+                <w:szCs w:val="19"/>
+              </w:rPr>
+              <w:t xml:space="preserve">Seguru veíkulu nian obrigatóriu tuir lei. Ita bele haruka ona kartaun seguru iha aplikasaun: se haruka, pasajeiru haree selu «Seguru ✓». HAKAT sei ezije ida-ne’e, ho avizu loron 30 molok.</w:t>
+            </w:r>
+          </w:p>
+        </w:tc>
+        <w:tc>
+          <w:tcPr>
+            <w:tcW w:type="pct" w:w="29%"/>
+          </w:tcPr>
+          <w:p>
+            <w:r>
+              <w:rPr>
+                <w:b w:val="false"/>
+                <w:bCs w:val="false"/>
+                <w:sz w:val="19"/>
+                <w:szCs w:val="19"/>
+              </w:rPr>
+              <w:t xml:space="preserve">Vehicle insurance is required by law. You can already send your insurance card in the app: drivers who do show passengers the «Insured ✓» badge. HAKAT will start requiring it, with 30 days’ notice.</w:t>
+            </w:r>
+          </w:p>
+        </w:tc>
+      </w:tr>
+      <w:tr>
+        <w:tc>
+          <w:tcPr>
+            <w:tcW w:type="pct" w:w="12%"/>
+          </w:tcPr>
+          <w:p>
+            <w:r>
+              <w:rPr>
+                <w:b w:val="false"/>
+                <w:bCs w:val="false"/>
+                <w:sz w:val="19"/>
+                <w:szCs w:val="19"/>
+              </w:rPr>
               <w:t xml:space="preserve">App · vTitularidade</w:t>
             </w:r>
           </w:p>
@@ -1002,6 +1069,274 @@
                 <w:sz w:val="19"/>
                 <w:szCs w:val="19"/>
               </w:rPr>
+              <w:t xml:space="preserve">App · docSeguro</w:t>
+            </w:r>
+          </w:p>
+        </w:tc>
+        <w:tc>
+          <w:tcPr>
+            <w:tcW w:type="pct" w:w="29%"/>
+          </w:tcPr>
+          <w:p>
+            <w:r>
+              <w:rPr>
+                <w:b w:val="false"/>
+                <w:bCs w:val="false"/>
+                <w:sz w:val="19"/>
+                <w:szCs w:val="19"/>
+              </w:rPr>
+              <w:t xml:space="preserve">Cartão do seguro</w:t>
+            </w:r>
+          </w:p>
+        </w:tc>
+        <w:tc>
+          <w:tcPr>
+            <w:tcW w:type="pct" w:w="30%"/>
+            <w:shd w:fill="FFF8F5" w:val="clear"/>
+          </w:tcPr>
+          <w:p>
+            <w:r>
+              <w:rPr>
+                <w:b w:val="false"/>
+                <w:bCs w:val="false"/>
+                <w:sz w:val="19"/>
+                <w:szCs w:val="19"/>
+              </w:rPr>
+              <w:t xml:space="preserve">Kartaun seguru</w:t>
+            </w:r>
+          </w:p>
+        </w:tc>
+        <w:tc>
+          <w:tcPr>
+            <w:tcW w:type="pct" w:w="29%"/>
+          </w:tcPr>
+          <w:p>
+            <w:r>
+              <w:rPr>
+                <w:b w:val="false"/>
+                <w:bCs w:val="false"/>
+                <w:sz w:val="19"/>
+                <w:szCs w:val="19"/>
+              </w:rPr>
+              <w:t xml:space="preserve">Insurance card</w:t>
+            </w:r>
+          </w:p>
+        </w:tc>
+      </w:tr>
+      <w:tr>
+        <w:tc>
+          <w:tcPr>
+            <w:tcW w:type="pct" w:w="12%"/>
+          </w:tcPr>
+          <w:p>
+            <w:r>
+              <w:rPr>
+                <w:b w:val="false"/>
+                <w:bCs w:val="false"/>
+                <w:sz w:val="19"/>
+                <w:szCs w:val="19"/>
+              </w:rPr>
+              <w:t xml:space="preserve">App · docSeguroNota</w:t>
+            </w:r>
+          </w:p>
+        </w:tc>
+        <w:tc>
+          <w:tcPr>
+            <w:tcW w:type="pct" w:w="29%"/>
+          </w:tcPr>
+          <w:p>
+            <w:r>
+              <w:rPr>
+                <w:b w:val="false"/>
+                <w:bCs w:val="false"/>
+                <w:sz w:val="19"/>
+                <w:szCs w:val="19"/>
+              </w:rPr>
+              <w:t xml:space="preserve">Seguro de responsabilidade civil do veículo, válido, que cubra o transporte de passageiros. Opcional por agora: quem o envia mostra ao passageiro o selo «Seguro ✓».</w:t>
+            </w:r>
+          </w:p>
+        </w:tc>
+        <w:tc>
+          <w:tcPr>
+            <w:tcW w:type="pct" w:w="30%"/>
+            <w:shd w:fill="FFF8F5" w:val="clear"/>
+          </w:tcPr>
+          <w:p>
+            <w:r>
+              <w:rPr>
+                <w:b w:val="false"/>
+                <w:bCs w:val="false"/>
+                <w:sz w:val="19"/>
+                <w:szCs w:val="19"/>
+              </w:rPr>
+              <w:t xml:space="preserve">Seguru responsabilidade sivil veíkulu nian, válidu, ne’ebé kobre transporte pasajeiru. Opsionál agora: se haruka, pasajeiru haree selu «Seguru ✓».</w:t>
+            </w:r>
+          </w:p>
+        </w:tc>
+        <w:tc>
+          <w:tcPr>
+            <w:tcW w:type="pct" w:w="29%"/>
+          </w:tcPr>
+          <w:p>
+            <w:r>
+              <w:rPr>
+                <w:b w:val="false"/>
+                <w:bCs w:val="false"/>
+                <w:sz w:val="19"/>
+                <w:szCs w:val="19"/>
+              </w:rPr>
+              <w:t xml:space="preserve">Valid third-party liability insurance for the vehicle, covering passenger transport. Optional for now: drivers who send it show passengers the «Insured ✓» badge.</w:t>
+            </w:r>
+          </w:p>
+        </w:tc>
+      </w:tr>
+      <w:tr>
+        <w:tc>
+          <w:tcPr>
+            <w:tcW w:type="pct" w:w="12%"/>
+          </w:tcPr>
+          <w:p>
+            <w:r>
+              <w:rPr>
+                <w:b w:val="false"/>
+                <w:bCs w:val="false"/>
+                <w:sz w:val="19"/>
+                <w:szCs w:val="19"/>
+              </w:rPr>
+              <w:t xml:space="preserve">App · docOpcional</w:t>
+            </w:r>
+          </w:p>
+        </w:tc>
+        <w:tc>
+          <w:tcPr>
+            <w:tcW w:type="pct" w:w="29%"/>
+          </w:tcPr>
+          <w:p>
+            <w:r>
+              <w:rPr>
+                <w:b w:val="false"/>
+                <w:bCs w:val="false"/>
+                <w:sz w:val="19"/>
+                <w:szCs w:val="19"/>
+              </w:rPr>
+              <w:t xml:space="preserve">opcional</w:t>
+            </w:r>
+          </w:p>
+        </w:tc>
+        <w:tc>
+          <w:tcPr>
+            <w:tcW w:type="pct" w:w="30%"/>
+            <w:shd w:fill="FFF8F5" w:val="clear"/>
+          </w:tcPr>
+          <w:p>
+            <w:r>
+              <w:rPr>
+                <w:b w:val="false"/>
+                <w:bCs w:val="false"/>
+                <w:sz w:val="19"/>
+                <w:szCs w:val="19"/>
+              </w:rPr>
+              <w:t xml:space="preserve">opsionál</w:t>
+            </w:r>
+          </w:p>
+        </w:tc>
+        <w:tc>
+          <w:tcPr>
+            <w:tcW w:type="pct" w:w="29%"/>
+          </w:tcPr>
+          <w:p>
+            <w:r>
+              <w:rPr>
+                <w:b w:val="false"/>
+                <w:bCs w:val="false"/>
+                <w:sz w:val="19"/>
+                <w:szCs w:val="19"/>
+              </w:rPr>
+              <w:t xml:space="preserve">optional</w:t>
+            </w:r>
+          </w:p>
+        </w:tc>
+      </w:tr>
+      <w:tr>
+        <w:tc>
+          <w:tcPr>
+            <w:tcW w:type="pct" w:w="12%"/>
+          </w:tcPr>
+          <w:p>
+            <w:r>
+              <w:rPr>
+                <w:b w:val="false"/>
+                <w:bCs w:val="false"/>
+                <w:sz w:val="19"/>
+                <w:szCs w:val="19"/>
+              </w:rPr>
+              <w:t xml:space="preserve">App · seloSeguro</w:t>
+            </w:r>
+          </w:p>
+        </w:tc>
+        <w:tc>
+          <w:tcPr>
+            <w:tcW w:type="pct" w:w="29%"/>
+          </w:tcPr>
+          <w:p>
+            <w:r>
+              <w:rPr>
+                <w:b w:val="false"/>
+                <w:bCs w:val="false"/>
+                <w:sz w:val="19"/>
+                <w:szCs w:val="19"/>
+              </w:rPr>
+              <w:t xml:space="preserve">Seguro ✓</w:t>
+            </w:r>
+          </w:p>
+        </w:tc>
+        <w:tc>
+          <w:tcPr>
+            <w:tcW w:type="pct" w:w="30%"/>
+            <w:shd w:fill="FFF8F5" w:val="clear"/>
+          </w:tcPr>
+          <w:p>
+            <w:r>
+              <w:rPr>
+                <w:b w:val="false"/>
+                <w:bCs w:val="false"/>
+                <w:sz w:val="19"/>
+                <w:szCs w:val="19"/>
+              </w:rPr>
+              <w:t xml:space="preserve">Seguru ✓</w:t>
+            </w:r>
+          </w:p>
+        </w:tc>
+        <w:tc>
+          <w:tcPr>
+            <w:tcW w:type="pct" w:w="29%"/>
+          </w:tcPr>
+          <w:p>
+            <w:r>
+              <w:rPr>
+                <w:b w:val="false"/>
+                <w:bCs w:val="false"/>
+                <w:sz w:val="19"/>
+                <w:szCs w:val="19"/>
+              </w:rPr>
+              <w:t xml:space="preserve">Insured ✓</w:t>
+            </w:r>
+          </w:p>
+        </w:tc>
+      </w:tr>
+      <w:tr>
+        <w:tc>
+          <w:tcPr>
+            <w:tcW w:type="pct" w:w="12%"/>
+          </w:tcPr>
+          <w:p>
+            <w:r>
+              <w:rPr>
+                <w:b w:val="false"/>
+                <w:bCs w:val="false"/>
+                <w:sz w:val="19"/>
+                <w:szCs w:val="19"/>
+              </w:rPr>
               <w:t xml:space="preserve">Servidor</w:t>
             </w:r>
           </w:p>
@@ -1186,6 +1521,73 @@
                 <w:szCs w:val="19"/>
               </w:rPr>
               <w:t xml:space="preserve">Vehicle owner’s authorisation</w:t>
+            </w:r>
+          </w:p>
+        </w:tc>
+      </w:tr>
+      <w:tr>
+        <w:tc>
+          <w:tcPr>
+            <w:tcW w:type="pct" w:w="12%"/>
+          </w:tcPr>
+          <w:p>
+            <w:r>
+              <w:rPr>
+                <w:b w:val="false"/>
+                <w:bCs w:val="false"/>
+                <w:sz w:val="19"/>
+                <w:szCs w:val="19"/>
+              </w:rPr>
+              <w:t xml:space="preserve">Notificação · doc_seguro</w:t>
+            </w:r>
+          </w:p>
+        </w:tc>
+        <w:tc>
+          <w:tcPr>
+            <w:tcW w:type="pct" w:w="29%"/>
+          </w:tcPr>
+          <w:p>
+            <w:r>
+              <w:rPr>
+                <w:b w:val="false"/>
+                <w:bCs w:val="false"/>
+                <w:sz w:val="19"/>
+                <w:szCs w:val="19"/>
+              </w:rPr>
+              <w:t xml:space="preserve">Cartão do seguro</w:t>
+            </w:r>
+          </w:p>
+        </w:tc>
+        <w:tc>
+          <w:tcPr>
+            <w:tcW w:type="pct" w:w="30%"/>
+            <w:shd w:fill="FFF8F5" w:val="clear"/>
+          </w:tcPr>
+          <w:p>
+            <w:r>
+              <w:rPr>
+                <w:b w:val="false"/>
+                <w:bCs w:val="false"/>
+                <w:sz w:val="19"/>
+                <w:szCs w:val="19"/>
+              </w:rPr>
+              <w:t xml:space="preserve">Kartaun seguru</w:t>
+            </w:r>
+          </w:p>
+        </w:tc>
+        <w:tc>
+          <w:tcPr>
+            <w:tcW w:type="pct" w:w="29%"/>
+          </w:tcPr>
+          <w:p>
+            <w:r>
+              <w:rPr>
+                <w:b w:val="false"/>
+                <w:bCs w:val="false"/>
+                <w:sz w:val="19"/>
+                <w:szCs w:val="19"/>
+              </w:rPr>
+              <w:t xml:space="preserve">Insurance card</w:t>
             </w:r>
           </w:p>
         </w:tc>

</xml_diff>